<commit_message>
update on 2026-03-03 20:11:31.637104
</commit_message>
<xml_diff>
--- a/py - file.docx
+++ b/py - file.docx
@@ -101,7 +101,7 @@
       </w:tblPr>
       <w:tblGrid>
         <w:gridCol w:w="3056"/>
-        <w:gridCol w:w="2459"/>
+        <w:gridCol w:w="2010"/>
       </w:tblGrid>
       <w:tr>
         <w:tblPrEx>
@@ -217,7 +217,7 @@
                   </w14:solidFill>
                 </w14:textFill>
               </w:rPr>
-              <w:t>返回满足表达式的</w:t>
+              <w:t>满足表达式的</w:t>
             </w:r>
             <w:r>
               <w:rPr>
@@ -437,6 +437,780 @@
     </w:p>
     <w:p>
       <w:pPr>
+        <w:outlineLvl w:val="0"/>
+        <w:rPr>
+          <w:rFonts w:hint="default" w:ascii="华文中宋" w:hAnsi="华文中宋" w:eastAsia="华文中宋" w:cs="华文中宋"/>
+          <w:b/>
+          <w:bCs/>
+          <w:color w:val="70AD47" w:themeColor="accent6"/>
+          <w:sz w:val="21"/>
+          <w:szCs w:val="24"/>
+          <w:lang w:val="en-US" w:eastAsia="zh-CN"/>
+          <w14:textFill>
+            <w14:solidFill>
+              <w14:schemeClr w14:val="accent6"/>
+            </w14:solidFill>
+          </w14:textFill>
+        </w:rPr>
+      </w:pPr>
+      <w:r>
+        <w:rPr>
+          <w:rFonts w:hint="eastAsia" w:ascii="华文中宋" w:hAnsi="华文中宋" w:eastAsia="华文中宋" w:cs="华文中宋"/>
+          <w:b/>
+          <w:bCs/>
+          <w:color w:val="70AD47" w:themeColor="accent6"/>
+          <w:sz w:val="21"/>
+          <w:szCs w:val="24"/>
+          <w:lang w:val="en-US" w:eastAsia="zh-CN"/>
+          <w14:textFill>
+            <w14:solidFill>
+              <w14:schemeClr w14:val="accent6"/>
+            </w14:solidFill>
+          </w14:textFill>
+        </w:rPr>
+        <w:t>日志logdir：</w:t>
+      </w:r>
+    </w:p>
+    <w:tbl>
+      <w:tblPr>
+        <w:tblStyle w:val="7"/>
+        <w:tblW w:w="0" w:type="auto"/>
+        <w:tblInd w:w="0" w:type="dxa"/>
+        <w:tblBorders>
+          <w:top w:val="single" w:color="auto" w:sz="4" w:space="0"/>
+          <w:left w:val="single" w:color="auto" w:sz="4" w:space="0"/>
+          <w:bottom w:val="single" w:color="auto" w:sz="4" w:space="0"/>
+          <w:right w:val="single" w:color="auto" w:sz="4" w:space="0"/>
+          <w:insideH w:val="single" w:color="auto" w:sz="4" w:space="0"/>
+          <w:insideV w:val="single" w:color="auto" w:sz="4" w:space="0"/>
+        </w:tblBorders>
+        <w:tblLayout w:type="autofit"/>
+        <w:tblCellMar>
+          <w:top w:w="0" w:type="dxa"/>
+          <w:left w:w="108" w:type="dxa"/>
+          <w:bottom w:w="0" w:type="dxa"/>
+          <w:right w:w="108" w:type="dxa"/>
+        </w:tblCellMar>
+      </w:tblPr>
+      <w:tblGrid>
+        <w:gridCol w:w="1113"/>
+        <w:gridCol w:w="2922"/>
+        <w:gridCol w:w="1113"/>
+      </w:tblGrid>
+      <w:tr>
+        <w:tblPrEx>
+          <w:tblBorders>
+            <w:top w:val="single" w:color="auto" w:sz="4" w:space="0"/>
+            <w:left w:val="single" w:color="auto" w:sz="4" w:space="0"/>
+            <w:bottom w:val="single" w:color="auto" w:sz="4" w:space="0"/>
+            <w:right w:val="single" w:color="auto" w:sz="4" w:space="0"/>
+            <w:insideH w:val="single" w:color="auto" w:sz="4" w:space="0"/>
+            <w:insideV w:val="single" w:color="auto" w:sz="4" w:space="0"/>
+          </w:tblBorders>
+          <w:tblCellMar>
+            <w:top w:w="0" w:type="dxa"/>
+            <w:left w:w="108" w:type="dxa"/>
+            <w:bottom w:w="0" w:type="dxa"/>
+            <w:right w:w="108" w:type="dxa"/>
+          </w:tblCellMar>
+        </w:tblPrEx>
+        <w:trPr>
+          <w:trHeight w:val="265" w:hRule="atLeast"/>
+        </w:trPr>
+        <w:tc>
+          <w:tcPr>
+            <w:tcW w:w="0" w:type="auto"/>
+            <w:gridSpan w:val="2"/>
+            <w:vAlign w:val="center"/>
+          </w:tcPr>
+          <w:p>
+            <w:pPr>
+              <w:jc w:val="both"/>
+              <w:outlineLvl w:val="9"/>
+              <w:rPr>
+                <w:rFonts w:hint="default" w:ascii="华文中宋" w:hAnsi="华文中宋" w:eastAsia="华文中宋" w:cs="华文中宋"/>
+                <w:b/>
+                <w:bCs/>
+                <w:i w:val="0"/>
+                <w:caps w:val="0"/>
+                <w:color w:val="FF0000"/>
+                <w:spacing w:val="7"/>
+                <w:sz w:val="21"/>
+                <w:szCs w:val="21"/>
+                <w:shd w:val="clear" w:color="auto" w:fill="auto"/>
+                <w:vertAlign w:val="baseline"/>
+                <w:lang w:val="en-US" w:eastAsia="zh-CN"/>
+              </w:rPr>
+            </w:pPr>
+            <w:r>
+              <w:rPr>
+                <w:rFonts w:hint="eastAsia" w:cs="华文中宋"/>
+                <w:b/>
+                <w:bCs/>
+                <w:i w:val="0"/>
+                <w:caps w:val="0"/>
+                <w:color w:val="FF0000"/>
+                <w:spacing w:val="7"/>
+                <w:sz w:val="21"/>
+                <w:szCs w:val="21"/>
+                <w:shd w:val="clear" w:color="auto" w:fill="auto"/>
+                <w:vertAlign w:val="baseline"/>
+                <w:lang w:val="en-US" w:eastAsia="zh-CN"/>
+              </w:rPr>
+              <w:t>LogDir(name, rootdir)</w:t>
+            </w:r>
+          </w:p>
+        </w:tc>
+        <w:tc>
+          <w:tcPr>
+            <w:tcW w:w="0" w:type="auto"/>
+            <w:vAlign w:val="center"/>
+          </w:tcPr>
+          <w:p>
+            <w:pPr>
+              <w:jc w:val="both"/>
+              <w:outlineLvl w:val="9"/>
+              <w:rPr>
+                <w:rFonts w:hint="default" w:cs="华文中宋"/>
+                <w:b/>
+                <w:bCs/>
+                <w:i w:val="0"/>
+                <w:caps w:val="0"/>
+                <w:color w:val="ED7D31" w:themeColor="accent2"/>
+                <w:spacing w:val="7"/>
+                <w:sz w:val="21"/>
+                <w:szCs w:val="21"/>
+                <w:vertAlign w:val="baseline"/>
+                <w:lang w:val="en-US" w:eastAsia="zh-CN"/>
+                <w14:textFill>
+                  <w14:solidFill>
+                    <w14:schemeClr w14:val="accent2"/>
+                  </w14:solidFill>
+                </w14:textFill>
+              </w:rPr>
+            </w:pPr>
+            <w:r>
+              <w:rPr>
+                <w:rFonts w:hint="eastAsia" w:cs="华文中宋"/>
+                <w:b/>
+                <w:bCs/>
+                <w:i w:val="0"/>
+                <w:caps w:val="0"/>
+                <w:color w:val="EA82F1"/>
+                <w:spacing w:val="7"/>
+                <w:sz w:val="21"/>
+                <w:szCs w:val="21"/>
+                <w:lang w:val="en-US" w:eastAsia="zh-CN"/>
+              </w:rPr>
+              <w:t>日志目录</w:t>
+            </w:r>
+          </w:p>
+        </w:tc>
+      </w:tr>
+      <w:tr>
+        <w:tblPrEx>
+          <w:tblBorders>
+            <w:top w:val="single" w:color="auto" w:sz="4" w:space="0"/>
+            <w:left w:val="single" w:color="auto" w:sz="4" w:space="0"/>
+            <w:bottom w:val="single" w:color="auto" w:sz="4" w:space="0"/>
+            <w:right w:val="single" w:color="auto" w:sz="4" w:space="0"/>
+            <w:insideH w:val="single" w:color="auto" w:sz="4" w:space="0"/>
+            <w:insideV w:val="single" w:color="auto" w:sz="4" w:space="0"/>
+          </w:tblBorders>
+          <w:tblCellMar>
+            <w:top w:w="0" w:type="dxa"/>
+            <w:left w:w="108" w:type="dxa"/>
+            <w:bottom w:w="0" w:type="dxa"/>
+            <w:right w:w="108" w:type="dxa"/>
+          </w:tblCellMar>
+        </w:tblPrEx>
+        <w:trPr>
+          <w:trHeight w:val="265" w:hRule="atLeast"/>
+        </w:trPr>
+        <w:tc>
+          <w:tcPr>
+            <w:tcW w:w="0" w:type="auto"/>
+            <w:vAlign w:val="center"/>
+          </w:tcPr>
+          <w:p>
+            <w:pPr>
+              <w:outlineLvl w:val="9"/>
+              <w:rPr>
+                <w:rFonts w:hint="default" w:ascii="华文中宋" w:hAnsi="华文中宋" w:eastAsia="华文中宋" w:cs="华文中宋"/>
+                <w:b/>
+                <w:bCs/>
+                <w:i w:val="0"/>
+                <w:caps w:val="0"/>
+                <w:color w:val="ED7D31" w:themeColor="accent2"/>
+                <w:spacing w:val="7"/>
+                <w:sz w:val="21"/>
+                <w:szCs w:val="21"/>
+                <w:vertAlign w:val="baseline"/>
+                <w:lang w:val="en-US" w:eastAsia="zh-CN"/>
+                <w14:textFill>
+                  <w14:solidFill>
+                    <w14:schemeClr w14:val="accent2"/>
+                  </w14:solidFill>
+                </w14:textFill>
+              </w:rPr>
+            </w:pPr>
+            <w:r>
+              <w:rPr>
+                <w:rFonts w:hint="eastAsia" w:cs="华文中宋"/>
+                <w:b/>
+                <w:bCs/>
+                <w:i w:val="0"/>
+                <w:caps w:val="0"/>
+                <w:color w:val="ED7D31" w:themeColor="accent2"/>
+                <w:spacing w:val="7"/>
+                <w:sz w:val="21"/>
+                <w:szCs w:val="21"/>
+                <w:vertAlign w:val="baseline"/>
+                <w:lang w:val="en-US" w:eastAsia="zh-CN"/>
+                <w14:textFill>
+                  <w14:solidFill>
+                    <w14:schemeClr w14:val="accent2"/>
+                  </w14:solidFill>
+                </w14:textFill>
+              </w:rPr>
+              <w:t>实例属性</w:t>
+            </w:r>
+          </w:p>
+        </w:tc>
+        <w:tc>
+          <w:tcPr>
+            <w:tcW w:w="0" w:type="auto"/>
+            <w:vAlign w:val="center"/>
+          </w:tcPr>
+          <w:p>
+            <w:pPr>
+              <w:jc w:val="both"/>
+              <w:outlineLvl w:val="9"/>
+              <w:rPr>
+                <w:rFonts w:hint="default" w:cs="华文中宋"/>
+                <w:b/>
+                <w:bCs/>
+                <w:i w:val="0"/>
+                <w:caps w:val="0"/>
+                <w:color w:val="FF0000"/>
+                <w:spacing w:val="7"/>
+                <w:sz w:val="21"/>
+                <w:szCs w:val="21"/>
+                <w:shd w:val="clear" w:color="auto" w:fill="auto"/>
+                <w:vertAlign w:val="baseline"/>
+                <w:lang w:val="en-US" w:eastAsia="zh-CN"/>
+              </w:rPr>
+            </w:pPr>
+            <w:r>
+              <w:rPr>
+                <w:rFonts w:hint="eastAsia" w:cs="华文中宋"/>
+                <w:b/>
+                <w:bCs/>
+                <w:i w:val="0"/>
+                <w:caps w:val="0"/>
+                <w:color w:val="FF0000"/>
+                <w:spacing w:val="7"/>
+                <w:sz w:val="21"/>
+                <w:szCs w:val="21"/>
+                <w:shd w:val="clear" w:color="auto" w:fill="auto"/>
+                <w:vertAlign w:val="baseline"/>
+                <w:lang w:val="en-US" w:eastAsia="zh-CN"/>
+              </w:rPr>
+              <w:t>logdir</w:t>
+            </w:r>
+          </w:p>
+        </w:tc>
+        <w:tc>
+          <w:tcPr>
+            <w:tcW w:w="0" w:type="auto"/>
+            <w:vAlign w:val="center"/>
+          </w:tcPr>
+          <w:p>
+            <w:pPr>
+              <w:jc w:val="both"/>
+              <w:outlineLvl w:val="9"/>
+              <w:rPr>
+                <w:rFonts w:hint="eastAsia" w:cs="华文中宋"/>
+                <w:b/>
+                <w:bCs/>
+                <w:i w:val="0"/>
+                <w:caps w:val="0"/>
+                <w:color w:val="ED7D31" w:themeColor="accent2"/>
+                <w:spacing w:val="7"/>
+                <w:sz w:val="21"/>
+                <w:szCs w:val="21"/>
+                <w:vertAlign w:val="baseline"/>
+                <w:lang w:val="en-US" w:eastAsia="zh-CN"/>
+                <w14:textFill>
+                  <w14:solidFill>
+                    <w14:schemeClr w14:val="accent2"/>
+                  </w14:solidFill>
+                </w14:textFill>
+              </w:rPr>
+            </w:pPr>
+            <w:r>
+              <w:rPr>
+                <w:rFonts w:hint="eastAsia" w:cs="华文中宋"/>
+                <w:b/>
+                <w:bCs/>
+                <w:i w:val="0"/>
+                <w:caps w:val="0"/>
+                <w:color w:val="EA82F1"/>
+                <w:spacing w:val="7"/>
+                <w:sz w:val="21"/>
+                <w:szCs w:val="21"/>
+                <w:lang w:val="en-US" w:eastAsia="zh-CN"/>
+              </w:rPr>
+              <w:t>目录</w:t>
+            </w:r>
+          </w:p>
+        </w:tc>
+      </w:tr>
+      <w:tr>
+        <w:tblPrEx>
+          <w:tblBorders>
+            <w:top w:val="single" w:color="auto" w:sz="4" w:space="0"/>
+            <w:left w:val="single" w:color="auto" w:sz="4" w:space="0"/>
+            <w:bottom w:val="single" w:color="auto" w:sz="4" w:space="0"/>
+            <w:right w:val="single" w:color="auto" w:sz="4" w:space="0"/>
+            <w:insideH w:val="single" w:color="auto" w:sz="4" w:space="0"/>
+            <w:insideV w:val="single" w:color="auto" w:sz="4" w:space="0"/>
+          </w:tblBorders>
+          <w:tblCellMar>
+            <w:top w:w="0" w:type="dxa"/>
+            <w:left w:w="108" w:type="dxa"/>
+            <w:bottom w:w="0" w:type="dxa"/>
+            <w:right w:w="108" w:type="dxa"/>
+          </w:tblCellMar>
+        </w:tblPrEx>
+        <w:trPr>
+          <w:trHeight w:val="265" w:hRule="atLeast"/>
+        </w:trPr>
+        <w:tc>
+          <w:tcPr>
+            <w:tcW w:w="0" w:type="auto"/>
+            <w:vMerge w:val="restart"/>
+            <w:vAlign w:val="center"/>
+          </w:tcPr>
+          <w:p>
+            <w:pPr>
+              <w:outlineLvl w:val="9"/>
+              <w:rPr>
+                <w:rFonts w:hint="default" w:cs="华文中宋"/>
+                <w:b/>
+                <w:bCs/>
+                <w:i w:val="0"/>
+                <w:caps w:val="0"/>
+                <w:color w:val="ED7D31" w:themeColor="accent2"/>
+                <w:spacing w:val="7"/>
+                <w:sz w:val="21"/>
+                <w:szCs w:val="21"/>
+                <w:vertAlign w:val="baseline"/>
+                <w:lang w:val="en-US" w:eastAsia="zh-CN"/>
+                <w14:textFill>
+                  <w14:solidFill>
+                    <w14:schemeClr w14:val="accent2"/>
+                  </w14:solidFill>
+                </w14:textFill>
+              </w:rPr>
+            </w:pPr>
+            <w:r>
+              <w:rPr>
+                <w:rFonts w:hint="eastAsia" w:cs="华文中宋"/>
+                <w:b/>
+                <w:bCs/>
+                <w:i w:val="0"/>
+                <w:caps w:val="0"/>
+                <w:color w:val="ED7D31" w:themeColor="accent2"/>
+                <w:spacing w:val="7"/>
+                <w:sz w:val="21"/>
+                <w:szCs w:val="21"/>
+                <w:vertAlign w:val="baseline"/>
+                <w:lang w:val="en-US" w:eastAsia="zh-CN"/>
+                <w14:textFill>
+                  <w14:solidFill>
+                    <w14:schemeClr w14:val="accent2"/>
+                  </w14:solidFill>
+                </w14:textFill>
+              </w:rPr>
+              <w:t>实例方法</w:t>
+            </w:r>
+          </w:p>
+        </w:tc>
+        <w:tc>
+          <w:tcPr>
+            <w:tcW w:w="0" w:type="auto"/>
+            <w:vAlign w:val="center"/>
+          </w:tcPr>
+          <w:p>
+            <w:pPr>
+              <w:jc w:val="both"/>
+              <w:outlineLvl w:val="9"/>
+              <w:rPr>
+                <w:rFonts w:hint="default" w:cs="华文中宋"/>
+                <w:b/>
+                <w:bCs/>
+                <w:i w:val="0"/>
+                <w:caps w:val="0"/>
+                <w:color w:val="FF0000"/>
+                <w:spacing w:val="7"/>
+                <w:sz w:val="21"/>
+                <w:szCs w:val="21"/>
+                <w:shd w:val="clear" w:color="auto" w:fill="auto"/>
+                <w:vertAlign w:val="baseline"/>
+                <w:lang w:val="en-US" w:eastAsia="zh-CN"/>
+              </w:rPr>
+            </w:pPr>
+            <w:r>
+              <w:rPr>
+                <w:rFonts w:hint="eastAsia" w:cs="华文中宋"/>
+                <w:b/>
+                <w:bCs/>
+                <w:i w:val="0"/>
+                <w:caps w:val="0"/>
+                <w:color w:val="FF0000"/>
+                <w:spacing w:val="7"/>
+                <w:sz w:val="21"/>
+                <w:szCs w:val="21"/>
+                <w:shd w:val="clear" w:color="auto" w:fill="auto"/>
+                <w:vertAlign w:val="baseline"/>
+                <w:lang w:val="en-US" w:eastAsia="zh-CN"/>
+              </w:rPr>
+              <w:t>pdir / pfile(name, touch)</w:t>
+            </w:r>
+          </w:p>
+        </w:tc>
+        <w:tc>
+          <w:tcPr>
+            <w:tcW w:w="0" w:type="auto"/>
+            <w:vAlign w:val="center"/>
+          </w:tcPr>
+          <w:p>
+            <w:pPr>
+              <w:jc w:val="both"/>
+              <w:outlineLvl w:val="9"/>
+              <w:rPr>
+                <w:rFonts w:hint="default" w:cs="华文中宋"/>
+                <w:b/>
+                <w:bCs/>
+                <w:i w:val="0"/>
+                <w:caps w:val="0"/>
+                <w:color w:val="EA82F1"/>
+                <w:spacing w:val="7"/>
+                <w:sz w:val="21"/>
+                <w:szCs w:val="21"/>
+                <w:lang w:val="en-US" w:eastAsia="zh-CN"/>
+              </w:rPr>
+            </w:pPr>
+            <w:r>
+              <w:rPr>
+                <w:rFonts w:hint="eastAsia" w:cs="华文中宋"/>
+                <w:b/>
+                <w:bCs/>
+                <w:i w:val="0"/>
+                <w:caps w:val="0"/>
+                <w:color w:val="EA82F1"/>
+                <w:spacing w:val="7"/>
+                <w:sz w:val="21"/>
+                <w:szCs w:val="21"/>
+                <w:lang w:val="en-US" w:eastAsia="zh-CN"/>
+              </w:rPr>
+              <w:t>获取</w:t>
+            </w:r>
+            <w:r>
+              <w:rPr>
+                <w:rFonts w:hint="eastAsia" w:cs="华文中宋"/>
+                <w:b/>
+                <w:bCs/>
+                <w:i w:val="0"/>
+                <w:caps w:val="0"/>
+                <w:color w:val="ED7D31" w:themeColor="accent2"/>
+                <w:spacing w:val="7"/>
+                <w:sz w:val="21"/>
+                <w:szCs w:val="21"/>
+                <w:lang w:val="en-US" w:eastAsia="zh-CN"/>
+                <w14:textFill>
+                  <w14:solidFill>
+                    <w14:schemeClr w14:val="accent2"/>
+                  </w14:solidFill>
+                </w14:textFill>
+              </w:rPr>
+              <w:t>路径</w:t>
+            </w:r>
+          </w:p>
+        </w:tc>
+      </w:tr>
+      <w:tr>
+        <w:tblPrEx>
+          <w:tblBorders>
+            <w:top w:val="single" w:color="auto" w:sz="4" w:space="0"/>
+            <w:left w:val="single" w:color="auto" w:sz="4" w:space="0"/>
+            <w:bottom w:val="single" w:color="auto" w:sz="4" w:space="0"/>
+            <w:right w:val="single" w:color="auto" w:sz="4" w:space="0"/>
+            <w:insideH w:val="single" w:color="auto" w:sz="4" w:space="0"/>
+            <w:insideV w:val="single" w:color="auto" w:sz="4" w:space="0"/>
+          </w:tblBorders>
+          <w:tblCellMar>
+            <w:top w:w="0" w:type="dxa"/>
+            <w:left w:w="108" w:type="dxa"/>
+            <w:bottom w:w="0" w:type="dxa"/>
+            <w:right w:w="108" w:type="dxa"/>
+          </w:tblCellMar>
+        </w:tblPrEx>
+        <w:trPr>
+          <w:trHeight w:val="265" w:hRule="atLeast"/>
+        </w:trPr>
+        <w:tc>
+          <w:tcPr>
+            <w:tcW w:w="0" w:type="auto"/>
+            <w:vMerge w:val="continue"/>
+            <w:tcBorders/>
+            <w:vAlign w:val="center"/>
+          </w:tcPr>
+          <w:p>
+            <w:pPr>
+              <w:outlineLvl w:val="9"/>
+              <w:rPr>
+                <w:rFonts w:hint="eastAsia" w:cs="华文中宋"/>
+                <w:b/>
+                <w:bCs/>
+                <w:i w:val="0"/>
+                <w:caps w:val="0"/>
+                <w:color w:val="ED7D31" w:themeColor="accent2"/>
+                <w:spacing w:val="7"/>
+                <w:sz w:val="21"/>
+                <w:szCs w:val="21"/>
+                <w:vertAlign w:val="baseline"/>
+                <w:lang w:val="en-US" w:eastAsia="zh-CN"/>
+                <w14:textFill>
+                  <w14:solidFill>
+                    <w14:schemeClr w14:val="accent2"/>
+                  </w14:solidFill>
+                </w14:textFill>
+              </w:rPr>
+            </w:pPr>
+          </w:p>
+        </w:tc>
+        <w:tc>
+          <w:tcPr>
+            <w:tcW w:w="0" w:type="auto"/>
+            <w:vAlign w:val="center"/>
+          </w:tcPr>
+          <w:p>
+            <w:pPr>
+              <w:jc w:val="both"/>
+              <w:outlineLvl w:val="9"/>
+              <w:rPr>
+                <w:rFonts w:hint="default" w:cs="华文中宋"/>
+                <w:b/>
+                <w:bCs/>
+                <w:i w:val="0"/>
+                <w:caps w:val="0"/>
+                <w:color w:val="FF0000"/>
+                <w:spacing w:val="7"/>
+                <w:sz w:val="21"/>
+                <w:szCs w:val="21"/>
+                <w:shd w:val="clear" w:color="auto" w:fill="auto"/>
+                <w:vertAlign w:val="baseline"/>
+                <w:lang w:val="en-US" w:eastAsia="zh-CN"/>
+              </w:rPr>
+            </w:pPr>
+            <w:r>
+              <w:rPr>
+                <w:rFonts w:hint="eastAsia" w:cs="华文中宋"/>
+                <w:b/>
+                <w:bCs/>
+                <w:i w:val="0"/>
+                <w:caps w:val="0"/>
+                <w:color w:val="FF0000"/>
+                <w:spacing w:val="7"/>
+                <w:sz w:val="21"/>
+                <w:szCs w:val="21"/>
+                <w:shd w:val="clear" w:color="auto" w:fill="auto"/>
+                <w:vertAlign w:val="baseline"/>
+                <w:lang w:val="en-US" w:eastAsia="zh-CN"/>
+              </w:rPr>
+              <w:t>copy(src, dest)</w:t>
+            </w:r>
+          </w:p>
+        </w:tc>
+        <w:tc>
+          <w:tcPr>
+            <w:tcW w:w="0" w:type="auto"/>
+            <w:vAlign w:val="center"/>
+          </w:tcPr>
+          <w:p>
+            <w:pPr>
+              <w:jc w:val="both"/>
+              <w:outlineLvl w:val="9"/>
+              <w:rPr>
+                <w:rFonts w:hint="default" w:cs="华文中宋"/>
+                <w:b/>
+                <w:bCs/>
+                <w:i w:val="0"/>
+                <w:caps w:val="0"/>
+                <w:color w:val="EA82F1"/>
+                <w:spacing w:val="7"/>
+                <w:sz w:val="21"/>
+                <w:szCs w:val="21"/>
+                <w:lang w:val="en-US" w:eastAsia="zh-CN"/>
+              </w:rPr>
+            </w:pPr>
+            <w:r>
+              <w:rPr>
+                <w:rFonts w:hint="eastAsia" w:cs="华文中宋"/>
+                <w:b/>
+                <w:bCs/>
+                <w:i w:val="0"/>
+                <w:caps w:val="0"/>
+                <w:color w:val="EA82F1"/>
+                <w:spacing w:val="7"/>
+                <w:sz w:val="21"/>
+                <w:szCs w:val="21"/>
+                <w:lang w:val="en-US" w:eastAsia="zh-CN"/>
+              </w:rPr>
+              <w:t>拷贝</w:t>
+            </w:r>
+          </w:p>
+        </w:tc>
+      </w:tr>
+      <w:tr>
+        <w:tblPrEx>
+          <w:tblBorders>
+            <w:top w:val="single" w:color="auto" w:sz="4" w:space="0"/>
+            <w:left w:val="single" w:color="auto" w:sz="4" w:space="0"/>
+            <w:bottom w:val="single" w:color="auto" w:sz="4" w:space="0"/>
+            <w:right w:val="single" w:color="auto" w:sz="4" w:space="0"/>
+            <w:insideH w:val="single" w:color="auto" w:sz="4" w:space="0"/>
+            <w:insideV w:val="single" w:color="auto" w:sz="4" w:space="0"/>
+          </w:tblBorders>
+          <w:tblCellMar>
+            <w:top w:w="0" w:type="dxa"/>
+            <w:left w:w="108" w:type="dxa"/>
+            <w:bottom w:w="0" w:type="dxa"/>
+            <w:right w:w="108" w:type="dxa"/>
+          </w:tblCellMar>
+        </w:tblPrEx>
+        <w:trPr>
+          <w:trHeight w:val="265" w:hRule="atLeast"/>
+        </w:trPr>
+        <w:tc>
+          <w:tcPr>
+            <w:tcW w:w="0" w:type="auto"/>
+            <w:vMerge w:val="continue"/>
+            <w:tcBorders/>
+            <w:vAlign w:val="center"/>
+          </w:tcPr>
+          <w:p>
+            <w:pPr>
+              <w:outlineLvl w:val="9"/>
+              <w:rPr>
+                <w:rFonts w:hint="eastAsia" w:cs="华文中宋"/>
+                <w:b/>
+                <w:bCs/>
+                <w:i w:val="0"/>
+                <w:caps w:val="0"/>
+                <w:color w:val="ED7D31" w:themeColor="accent2"/>
+                <w:spacing w:val="7"/>
+                <w:sz w:val="21"/>
+                <w:szCs w:val="21"/>
+                <w:vertAlign w:val="baseline"/>
+                <w:lang w:val="en-US" w:eastAsia="zh-CN"/>
+                <w14:textFill>
+                  <w14:solidFill>
+                    <w14:schemeClr w14:val="accent2"/>
+                  </w14:solidFill>
+                </w14:textFill>
+              </w:rPr>
+            </w:pPr>
+          </w:p>
+        </w:tc>
+        <w:tc>
+          <w:tcPr>
+            <w:tcW w:w="0" w:type="auto"/>
+            <w:vAlign w:val="center"/>
+          </w:tcPr>
+          <w:p>
+            <w:pPr>
+              <w:jc w:val="both"/>
+              <w:outlineLvl w:val="9"/>
+              <w:rPr>
+                <w:rFonts w:hint="default" w:cs="华文中宋"/>
+                <w:b/>
+                <w:bCs/>
+                <w:i w:val="0"/>
+                <w:caps w:val="0"/>
+                <w:color w:val="FF0000"/>
+                <w:spacing w:val="7"/>
+                <w:sz w:val="21"/>
+                <w:szCs w:val="21"/>
+                <w:shd w:val="clear" w:color="auto" w:fill="auto"/>
+                <w:vertAlign w:val="baseline"/>
+                <w:lang w:val="en-US" w:eastAsia="zh-CN"/>
+              </w:rPr>
+            </w:pPr>
+            <w:r>
+              <w:rPr>
+                <w:rFonts w:hint="eastAsia" w:cs="华文中宋"/>
+                <w:b/>
+                <w:bCs/>
+                <w:i w:val="0"/>
+                <w:caps w:val="0"/>
+                <w:color w:val="FF0000"/>
+                <w:spacing w:val="7"/>
+                <w:sz w:val="21"/>
+                <w:szCs w:val="21"/>
+                <w:shd w:val="clear" w:color="auto" w:fill="auto"/>
+                <w:vertAlign w:val="baseline"/>
+                <w:lang w:val="en-US" w:eastAsia="zh-CN"/>
+              </w:rPr>
+              <w:t>save_data(data, file)</w:t>
+            </w:r>
+          </w:p>
+        </w:tc>
+        <w:tc>
+          <w:tcPr>
+            <w:tcW w:w="0" w:type="auto"/>
+            <w:vAlign w:val="center"/>
+          </w:tcPr>
+          <w:p>
+            <w:pPr>
+              <w:jc w:val="both"/>
+              <w:outlineLvl w:val="9"/>
+              <w:rPr>
+                <w:rFonts w:hint="default" w:cs="华文中宋"/>
+                <w:b/>
+                <w:bCs/>
+                <w:i w:val="0"/>
+                <w:caps w:val="0"/>
+                <w:color w:val="EA82F1"/>
+                <w:spacing w:val="7"/>
+                <w:sz w:val="21"/>
+                <w:szCs w:val="21"/>
+                <w:lang w:val="en-US" w:eastAsia="zh-CN"/>
+              </w:rPr>
+            </w:pPr>
+            <w:r>
+              <w:rPr>
+                <w:rFonts w:hint="eastAsia" w:cs="华文中宋"/>
+                <w:b/>
+                <w:bCs/>
+                <w:i w:val="0"/>
+                <w:caps w:val="0"/>
+                <w:color w:val="EA82F1"/>
+                <w:spacing w:val="7"/>
+                <w:sz w:val="21"/>
+                <w:szCs w:val="21"/>
+                <w:lang w:val="en-US" w:eastAsia="zh-CN"/>
+              </w:rPr>
+              <w:t>保存</w:t>
+            </w:r>
+          </w:p>
+        </w:tc>
+      </w:tr>
+    </w:tbl>
+    <w:p>
+      <w:pPr>
         <w:numPr>
           <w:ilvl w:val="0"/>
           <w:numId w:val="0"/>
@@ -461,6 +1235,56 @@
           </w14:textFill>
         </w:rPr>
       </w:pPr>
+    </w:p>
+    <w:p>
+      <w:pPr>
+        <w:numPr>
+          <w:ilvl w:val="0"/>
+          <w:numId w:val="0"/>
+        </w:numPr>
+        <w:outlineLvl w:val="9"/>
+        <w:rPr>
+          <w:rFonts w:hint="default" w:ascii="华文中宋" w:hAnsi="华文中宋" w:eastAsia="华文中宋" w:cs="华文中宋"/>
+          <w:b/>
+          <w:bCs/>
+          <w:i w:val="0"/>
+          <w:caps w:val="0"/>
+          <w:color w:val="ED7D31" w:themeColor="accent2"/>
+          <w:spacing w:val="7"/>
+          <w:sz w:val="21"/>
+          <w:szCs w:val="21"/>
+          <w:vertAlign w:val="baseline"/>
+          <w:lang w:val="en-US" w:eastAsia="zh-CN"/>
+          <w14:textFill>
+            <w14:solidFill>
+              <w14:schemeClr w14:val="accent2"/>
+            </w14:solidFill>
+          </w14:textFill>
+        </w:rPr>
+      </w:pPr>
+      <w:r>
+        <w:rPr>
+          <w:rFonts w:hint="eastAsia" w:cs="华文中宋"/>
+          <w:b/>
+          <w:bCs/>
+          <w:i w:val="0"/>
+          <w:caps w:val="0"/>
+          <w:color w:val="ED7D31" w:themeColor="accent2"/>
+          <w:spacing w:val="7"/>
+          <w:sz w:val="21"/>
+          <w:szCs w:val="21"/>
+          <w:vertAlign w:val="baseline"/>
+          <w:lang w:val="en-US" w:eastAsia="zh-CN"/>
+          <w14:textFill>
+            <w14:solidFill>
+              <w14:schemeClr w14:val="accent2"/>
+            </w14:solidFill>
+          </w14:textFill>
+        </w:rPr>
+        <w:t xml:space="preserve"> </w:t>
+      </w:r>
+      <w:bookmarkStart w:id="23" w:name="_GoBack"/>
+      <w:bookmarkEnd w:id="23"/>
     </w:p>
     <w:p>
       <w:pPr>
@@ -656,27 +1480,6 @@
             </w:pPr>
             <w:r>
               <w:rPr>
-                <w:rFonts w:hint="eastAsia" w:cs="华文中宋"/>
-                <w:b/>
-                <w:bCs/>
-                <w:i w:val="0"/>
-                <w:caps w:val="0"/>
-                <w:color w:val="ED7D31" w:themeColor="accent2"/>
-                <w:spacing w:val="7"/>
-                <w:sz w:val="21"/>
-                <w:szCs w:val="21"/>
-                <w:vertAlign w:val="baseline"/>
-                <w:lang w:val="en-US" w:eastAsia="zh-CN"/>
-                <w14:textFill>
-                  <w14:solidFill>
-                    <w14:schemeClr w14:val="accent2"/>
-                  </w14:solidFill>
-                </w14:textFill>
-              </w:rPr>
-              <w:t>实例化</w:t>
-            </w:r>
-            <w:r>
-              <w:rPr>
                 <w:rFonts w:hint="eastAsia" w:ascii="华文中宋" w:hAnsi="华文中宋" w:eastAsia="华文中宋" w:cs="华文中宋"/>
                 <w:b/>
                 <w:bCs/>
@@ -689,21 +1492,6 @@
                 <w:lang w:val="en-US" w:eastAsia="zh-CN"/>
               </w:rPr>
               <w:t>路径</w:t>
-            </w:r>
-            <w:r>
-              <w:rPr>
-                <w:rFonts w:hint="eastAsia" w:cs="华文中宋"/>
-                <w:b/>
-                <w:bCs/>
-                <w:i w:val="0"/>
-                <w:caps w:val="0"/>
-                <w:color w:val="EA82F1"/>
-                <w:spacing w:val="7"/>
-                <w:sz w:val="21"/>
-                <w:szCs w:val="21"/>
-                <w:lang w:val="en-US" w:eastAsia="zh-CN"/>
-              </w:rPr>
-              <w:t>实例</w:t>
             </w:r>
           </w:p>
         </w:tc>
@@ -1158,8 +1946,6 @@
               </w:rPr>
               <w:t>盘符/成分</w:t>
             </w:r>
-            <w:bookmarkStart w:id="23" w:name="_GoBack"/>
-            <w:bookmarkEnd w:id="23"/>
           </w:p>
         </w:tc>
       </w:tr>
@@ -4476,12 +5262,6 @@
             <w:insideH w:val="single" w:color="auto" w:sz="4" w:space="0"/>
             <w:insideV w:val="single" w:color="auto" w:sz="4" w:space="0"/>
           </w:tblBorders>
-          <w:tblCellMar>
-            <w:top w:w="0" w:type="dxa"/>
-            <w:left w:w="108" w:type="dxa"/>
-            <w:bottom w:w="0" w:type="dxa"/>
-            <w:right w:w="108" w:type="dxa"/>
-          </w:tblCellMar>
         </w:tblPrEx>
         <w:trPr>
           <w:trHeight w:val="190" w:hRule="atLeast"/>
@@ -6878,6 +7658,12 @@
             <w:insideH w:val="single" w:color="auto" w:sz="4" w:space="0"/>
             <w:insideV w:val="single" w:color="auto" w:sz="4" w:space="0"/>
           </w:tblBorders>
+          <w:tblCellMar>
+            <w:top w:w="0" w:type="dxa"/>
+            <w:left w:w="108" w:type="dxa"/>
+            <w:bottom w:w="0" w:type="dxa"/>
+            <w:right w:w="108" w:type="dxa"/>
+          </w:tblCellMar>
         </w:tblPrEx>
         <w:tc>
           <w:tcPr>
@@ -11188,12 +11974,6 @@
             <w:insideH w:val="single" w:color="auto" w:sz="4" w:space="0"/>
             <w:insideV w:val="single" w:color="auto" w:sz="4" w:space="0"/>
           </w:tblBorders>
-          <w:tblCellMar>
-            <w:top w:w="0" w:type="dxa"/>
-            <w:left w:w="108" w:type="dxa"/>
-            <w:bottom w:w="0" w:type="dxa"/>
-            <w:right w:w="108" w:type="dxa"/>
-          </w:tblCellMar>
         </w:tblPrEx>
         <w:tc>
           <w:tcPr>
@@ -14288,12 +15068,6 @@
             <w:insideH w:val="single" w:color="auto" w:sz="4" w:space="0"/>
             <w:insideV w:val="single" w:color="auto" w:sz="4" w:space="0"/>
           </w:tblBorders>
-          <w:tblCellMar>
-            <w:top w:w="0" w:type="dxa"/>
-            <w:left w:w="108" w:type="dxa"/>
-            <w:bottom w:w="0" w:type="dxa"/>
-            <w:right w:w="108" w:type="dxa"/>
-          </w:tblCellMar>
         </w:tblPrEx>
         <w:tc>
           <w:tcPr>
@@ -21949,12 +22723,6 @@
             <w:insideH w:val="single" w:color="auto" w:sz="4" w:space="0"/>
             <w:insideV w:val="single" w:color="auto" w:sz="4" w:space="0"/>
           </w:tblBorders>
-          <w:tblCellMar>
-            <w:top w:w="0" w:type="dxa"/>
-            <w:left w:w="108" w:type="dxa"/>
-            <w:bottom w:w="0" w:type="dxa"/>
-            <w:right w:w="108" w:type="dxa"/>
-          </w:tblCellMar>
         </w:tblPrEx>
         <w:tc>
           <w:tcPr>

</xml_diff>